<commit_message>
Remove APLB_PLAN.md and refactor the application to integrate the new DocxEditor component. Update dependencies for docx editing capabilities and adjust the EditorPane to utilize the new editor. Modify sample LOI generation script and update various components for improved functionality and UI consistency.
</commit_message>
<xml_diff>
--- a/public/templates/sample-loi.docx
+++ b/public/templates/sample-loi.docx
@@ -156,7 +156,7 @@
           </w:tcPr>
           <w:p>
             <w:r>
-              <w:t xml:space="preserve">Dollar Tree Stores, Inc., a VA corporation</w:t>
+              <w:t xml:space="preserve">Tenant Corp, Inc., a VA corporation</w:t>
             </w:r>
           </w:p>
         </w:tc>
@@ -400,7 +400,7 @@
     </w:p>
     <w:p>
       <w:r>
-        <w:t xml:space="preserve">Dollar Tree Stores, Inc.</w:t>
+        <w:t xml:space="preserve">Tenant Corp, Inc.</w:t>
       </w:r>
     </w:p>
     <w:sectPr>

</xml_diff>